<commit_message>
Add plain-language tips and merchant follow-up scenarios
</commit_message>
<xml_diff>
--- a/chenchen/docs/2026-10-05产品迭代与功能候选.docx
+++ b/chenchen/docs/2026-10-05产品迭代与功能候选.docx
@@ -12,12 +12,12 @@
     </w:p>
     <w:p>
       <w:r>
-        <w:t>2026 年 10 月 5 日  |  v0.5.0  |  本地演示版</w:t>
+        <w:t>2026 年 10 月 5 日  |  v0.6.0  |  本地演示版</w:t>
       </w:r>
     </w:p>
     <w:p>
       <w:r>
-        <w:t>这轮我们重点解决“打开后先看什么”和“结果能不能信”的问题。投资顾问与店主助手保留独立入口、页面和操作流程，共用本地演示服务。改动只放在 chenchen 文件夹，不改仓库其他成员的内容。</w:t>
+        <w:t>本轮按已确认的 1、3、4、5 项继续开发：给专业词加白话 Tips，让投资结论显示数据依据，让店主能处理提醒，并支持单笔到账延迟试算。投资顾问与店主助手仍是两个独立产品。</w:t>
       </w:r>
     </w:p>
     <w:p>
@@ -77,6 +77,66 @@
         <w:pStyle w:val="Heading1"/>
       </w:pPr>
       <w:r>
+        <w:t>本轮选择与实现</w:t>
+      </w:r>
+    </w:p>
+    <w:p>
+      <w:pPr>
+        <w:pStyle w:val="Heading2"/>
+      </w:pPr>
+      <w:r>
+        <w:t>专业词旁边的白话 Tips</w:t>
+      </w:r>
+    </w:p>
+    <w:p>
+      <w:r>
+        <w:t>在投资期限、最大可接受回撤、流动性需求、历史最大回撤、现金占比和店主余额等词旁边增加小问号。Tips 默认收起，点击后显示一句白话解释，不会把长说明铺在首屏。</w:t>
+      </w:r>
+    </w:p>
+    <w:p>
+      <w:pPr>
+        <w:pStyle w:val="Heading2"/>
+      </w:pPr>
+      <w:r>
+        <w:t>投资结论显示依据</w:t>
+      </w:r>
+    </w:p>
+    <w:p>
+      <w:r>
+        <w:t>投资结果增加“为什么这样判断”。它会列出当前最大仓位、三条路径是否使用同一数据和费用口径、样本内回撤与换手率，并再次提醒这不是个性化推荐。</w:t>
+      </w:r>
+    </w:p>
+    <w:p>
+      <w:pPr>
+        <w:pStyle w:val="Heading2"/>
+      </w:pPr>
+      <w:r>
+        <w:t>店主提醒处理状态</w:t>
+      </w:r>
+    </w:p>
+    <w:p>
+      <w:r>
+        <w:t>每条提醒可以标记为“待处理、已核实、已处理”。列表会把未完成的提醒放在前面。状态只在当前演示会话中保存，不代表银行或支付平台已经确认。</w:t>
+      </w:r>
+    </w:p>
+    <w:p>
+      <w:pPr>
+        <w:pStyle w:val="Heading2"/>
+      </w:pPr>
+      <w:r>
+        <w:t>单笔到账延迟试算</w:t>
+      </w:r>
+    </w:p>
+    <w:p>
+      <w:r>
+        <w:t>在现金日历中选择一笔未到账收入，设置不延迟、晚 3 天或晚 7 天，查看预计缺口日期如何变化。试算只移动这一笔收入，不修改原账单，也不自动改变付款日期。</w:t>
+      </w:r>
+    </w:p>
+    <w:p>
+      <w:pPr>
+        <w:pStyle w:val="Heading1"/>
+      </w:pPr>
+      <w:r>
         <w:t>减少看错结果的情况</w:t>
       </w:r>
     </w:p>
@@ -93,15 +153,14 @@
     <w:p>
       <w:pPr>
         <w:pStyle w:val="Heading1"/>
-        <w:pageBreakBefore/>
       </w:pPr>
       <w:r>
-        <w:t>还可以加什么</w:t>
+        <w:t>后续候选功能</w:t>
       </w:r>
     </w:p>
     <w:p>
       <w:r>
-        <w:t>下面都是未实现的候选功能，先供选择。它们对应已约定的 Agent 运行与记忆、工具与金融数据职责，不代表比赛新增硬性要求。建议下一轮优先选“与上次相比”和“提醒处理记录”。</w:t>
+        <w:t>下面仍未实现，后续开发前继续由你选择。它们对应已约定的 Agent 运行与记忆、工具与金融数据职责，不代表比赛新增硬性要求。</w:t>
       </w:r>
     </w:p>
     <w:p>
@@ -127,7 +186,7 @@
     </w:p>
     <w:p>
       <w:r>
-        <w:t>让店主把一条提醒标为待办、已核实或已处理，附一小段备注。下次打开先看尚未处理的事情。归属 Agent 状态与记忆；不代替银行确认，也不自动付款。</w:t>
+        <w:t>本项已在本轮实现。下一步可以增加一小段处理备注，并在会话内保留处理记录。归属 Agent 状态与记忆；不代替银行确认，也不自动付款。</w:t>
       </w:r>
     </w:p>
     <w:p>
@@ -140,7 +199,7 @@
     </w:p>
     <w:p>
       <w:r>
-        <w:t>在现有统一延迟之外，选择一笔收入，试算晚到账几天会影响哪次付款。归属金融数据工具；只生成情景，不修改原账单或承诺平台到账。</w:t>
+        <w:t>本项已在本轮实现。后续可以增加多笔收入同时延迟的组合试算。归属金融数据工具；只生成情景，不修改原账单或承诺平台到账。</w:t>
       </w:r>
     </w:p>
     <w:p>
@@ -179,7 +238,7 @@
     </w:p>
     <w:p>
       <w:r>
-        <w:t>语法检查通过，40 项自动测试通过。新增检查覆盖数据日期、方案比较、账单排序、当前负余额和页面资源加载。浏览器已检查桌面及 390 像素窄屏，并实际操作诊断、改输入、展开账单、确认、延迟切换与导出。通过测试不等于没有任何缺陷。</w:t>
+        <w:t>语法检查通过，42 项自动测试通过。新增检查覆盖数据日期、方案比较、账单排序、当前负余额、提醒状态、单笔到账试算和页面资源加载。浏览器已实际操作 Tips、投资诊断、判断依据、账单确认、提醒状态切换、单笔试算和导出。通过测试不等于没有任何缺陷。</w:t>
       </w:r>
     </w:p>
     <w:p>

</xml_diff>

<commit_message>
Add merchant reminder notes
</commit_message>
<xml_diff>
--- a/chenchen/docs/2026-10-05产品迭代与功能候选.docx
+++ b/chenchen/docs/2026-10-05产品迭代与功能候选.docx
@@ -12,12 +12,12 @@
     </w:p>
     <w:p>
       <w:r>
-        <w:t>2026 年 10 月 5 日  |  v0.6.0  |  本地演示版</w:t>
+        <w:t>2026 年 10 月 5 日  |  v0.7.0  |  本地演示版</w:t>
       </w:r>
     </w:p>
     <w:p>
       <w:r>
-        <w:t>本轮按已确认的 1、3、4、5 项继续开发：给专业词加白话 Tips，让投资结论显示数据依据，让店主能处理提醒，并支持单笔到账延迟试算。投资顾问与店主助手仍是两个独立产品。</w:t>
+        <w:t>本轮在已完成的 1、3、4、5 项基础上继续迭代：让店主可以在提醒详情中保存一句处理备注，记住已经联系谁、下一步做什么。投资顾问与店主助手仍是两个独立产品。</w:t>
       </w:r>
     </w:p>
     <w:p>
@@ -116,7 +116,7 @@
     </w:p>
     <w:p>
       <w:r>
-        <w:t>每条提醒可以标记为“待处理、已核实、已处理”。列表会把未完成的提醒放在前面。状态只在当前演示会话中保存，不代表银行或支付平台已经确认。</w:t>
+        <w:t>每条提醒可以标记为“待处理、已核实、已处理”。展开提醒后可以写一句不超过 240 字的处理备注，例如“已联系平台，等回款”，并保存到当前演示会话。列表会把未完成的提醒放在前面；这些记录不代表银行或支付平台已经确认。</w:t>
       </w:r>
     </w:p>
     <w:p>
@@ -186,7 +186,7 @@
     </w:p>
     <w:p>
       <w:r>
-        <w:t>本项已在本轮实现。下一步可以增加一小段处理备注，并在会话内保留处理记录。归属 Agent 状态与记忆；不代替银行确认，也不自动付款。</w:t>
+        <w:t>本轮增加提醒处理备注：备注会与状态一起保留在当前会话，重新生成提醒时仍能看到。备注长度限制为 240 字，空白备注可以清除。归属 Agent 状态与记忆；不代替银行确认，也不自动付款。后续可以再增加按日期查看处理历史。</w:t>
       </w:r>
     </w:p>
     <w:p>
@@ -238,7 +238,7 @@
     </w:p>
     <w:p>
       <w:r>
-        <w:t>语法检查通过，42 项自动测试通过。新增检查覆盖数据日期、方案比较、账单排序、当前负余额、提醒状态、单笔到账试算和页面资源加载。浏览器已实际操作 Tips、投资诊断、判断依据、账单确认、提醒状态切换、单笔试算和导出。通过测试不等于没有任何缺陷。</w:t>
+        <w:t>语法检查通过，42 项自动测试通过。新增检查覆盖数据日期、方案比较、账单排序、当前负余额、提醒状态与备注、单笔到账试算和页面资源加载。浏览器已实际操作 Tips、投资诊断、判断依据、账单确认、提醒状态切换、处理备注、单笔试算和导出。通过测试不等于没有任何缺陷。</w:t>
       </w:r>
     </w:p>
     <w:p>

</xml_diff>